<commit_message>
docs: record production verification for schedule navigation fix
</commit_message>
<xml_diff>
--- a/jackyun-portal/docs/schedule-direct-navigation-fix-3.62.3.docx
+++ b/jackyun-portal/docs/schedule-direct-navigation-fix-3.62.3.docx
@@ -145,27 +145,48 @@
         <w:spacing w:after="120" w:line="300"/>
       </w:pPr>
       <w:r>
-        <w:rPr>
-          <w:rFonts w:ascii="Microsoft YaHei" w:cs="Microsoft YaHei" w:eastAsia="Microsoft YaHei" w:hAnsi="Microsoft YaHei"/>
-          <w:color w:val="252B36"/>
-          <w:sz w:val="21"/>
-          <w:szCs w:val="21"/>
-        </w:rPr>
-        <w:t xml:space="preserve">已核对 main 与本机基线版本均为 3.62.2。当前线上匿名 GET /schedule 返回 200 并包含“学习日程”页面标题。这个检查不代表已登录账号及其设备缓存状态；部署与账号态直达验证将在合并后继续确认。</w:t>
-      </w:r>
-    </w:p>
-    <w:p>
-      <w:pPr>
-        <w:spacing w:after="120" w:line="300"/>
-      </w:pPr>
-      <w:r>
-        <w:rPr>
-          <w:rFonts w:ascii="Microsoft YaHei" w:cs="Microsoft YaHei" w:eastAsia="Microsoft YaHei" w:hAnsi="Microsoft YaHei"/>
-          <w:color w:val="252B36"/>
-          <w:sz w:val="21"/>
-          <w:szCs w:val="21"/>
-        </w:rPr>
-        <w:t xml:space="preserve">发布状态：代码已准备，部署验证待完成。</w:t>
+        <w:t>已核对 main 与本机基线版本均为 3.62.2。线上匿名 GET /schedule 返回 200 并包含“学习日程”页面标题。生产部署与脚本版本已确认；这不代表已登录账号及设备缓存状态完全验证，仍建议用户设备重访一次直达链接。</w:t>
+      </w:r>
+    </w:p>
+    <w:p>
+      <w:pPr>
+        <w:spacing w:after="120" w:line="300"/>
+      </w:pPr>
+      <w:r>
+        <w:t>发布状态：已合并至 main，生产部署 READY。</w:t>
+      </w:r>
+    </w:p>
+    <w:p>
+      <w:pPr>
+        <w:spacing w:after="0"/>
+      </w:pPr>
+      <w:r>
+        <w:rPr>
+          <w:rFonts w:ascii="Microsoft YaHei" w:hAnsi="Microsoft YaHei"/>
+        </w:rPr>
+        <w:t>合并提交：3501d8ccad04355c77a4a8ee58d4bcd9251e843b。Vercel 生产部署状态为 READY。</w:t>
+      </w:r>
+    </w:p>
+    <w:p>
+      <w:pPr>
+        <w:spacing w:after="0"/>
+      </w:pPr>
+      <w:r>
+        <w:rPr>
+          <w:rFonts w:ascii="Microsoft YaHei" w:hAnsi="Microsoft YaHei"/>
+        </w:rPr>
+        <w:t>线上 GET https://jackyun.top/schedule 返回 200，页面标题为“学习日程 · JackYun Portal”。线上 GET /sw.js 返回 200，已包含缓存版本 v14 与新的导航重试逻辑。</w:t>
+      </w:r>
+    </w:p>
+    <w:p>
+      <w:pPr>
+        <w:spacing w:after="0"/>
+      </w:pPr>
+      <w:r>
+        <w:rPr>
+          <w:rFonts w:ascii="Microsoft YaHei" w:hAnsi="Microsoft YaHei"/>
+        </w:rPr>
+        <w:t>验证边界：线上检查确认了匿名页面响应和部署脚本版本；尚未在用户真实账号及其设备缓存环境中再次操作浏览器直接访问。</w:t>
       </w:r>
     </w:p>
     <w:sectPr>

</xml_diff>

<commit_message>
docs: record schedule navigation deployment verification
Update the DOCX task record with production deployment checks.
</commit_message>
<xml_diff>
--- a/jackyun-portal/docs/schedule-direct-navigation-fix-3.62.3.docx
+++ b/jackyun-portal/docs/schedule-direct-navigation-fix-3.62.3.docx
@@ -145,27 +145,48 @@
         <w:spacing w:after="120" w:line="300"/>
       </w:pPr>
       <w:r>
-        <w:rPr>
-          <w:rFonts w:ascii="Microsoft YaHei" w:cs="Microsoft YaHei" w:eastAsia="Microsoft YaHei" w:hAnsi="Microsoft YaHei"/>
-          <w:color w:val="252B36"/>
-          <w:sz w:val="21"/>
-          <w:szCs w:val="21"/>
-        </w:rPr>
-        <w:t xml:space="preserve">已核对 main 与本机基线版本均为 3.62.2。当前线上匿名 GET /schedule 返回 200 并包含“学习日程”页面标题。这个检查不代表已登录账号及其设备缓存状态；部署与账号态直达验证将在合并后继续确认。</w:t>
-      </w:r>
-    </w:p>
-    <w:p>
-      <w:pPr>
-        <w:spacing w:after="120" w:line="300"/>
-      </w:pPr>
-      <w:r>
-        <w:rPr>
-          <w:rFonts w:ascii="Microsoft YaHei" w:cs="Microsoft YaHei" w:eastAsia="Microsoft YaHei" w:hAnsi="Microsoft YaHei"/>
-          <w:color w:val="252B36"/>
-          <w:sz w:val="21"/>
-          <w:szCs w:val="21"/>
-        </w:rPr>
-        <w:t xml:space="preserve">发布状态：代码已准备，部署验证待完成。</w:t>
+        <w:t>已核对 main 与本机基线版本均为 3.62.2。线上匿名 GET /schedule 返回 200 并包含“学习日程”页面标题。生产部署与脚本版本已确认；这不代表已登录账号及设备缓存状态完全验证，仍建议用户设备重访一次直达链接。</w:t>
+      </w:r>
+    </w:p>
+    <w:p>
+      <w:pPr>
+        <w:spacing w:after="120" w:line="300"/>
+      </w:pPr>
+      <w:r>
+        <w:t>发布状态：已合并至 main，生产部署 READY。</w:t>
+      </w:r>
+    </w:p>
+    <w:p>
+      <w:pPr>
+        <w:spacing w:after="0"/>
+      </w:pPr>
+      <w:r>
+        <w:rPr>
+          <w:rFonts w:ascii="Microsoft YaHei" w:hAnsi="Microsoft YaHei"/>
+        </w:rPr>
+        <w:t>合并提交：3501d8ccad04355c77a4a8ee58d4bcd9251e843b。Vercel 生产部署状态为 READY。</w:t>
+      </w:r>
+    </w:p>
+    <w:p>
+      <w:pPr>
+        <w:spacing w:after="0"/>
+      </w:pPr>
+      <w:r>
+        <w:rPr>
+          <w:rFonts w:ascii="Microsoft YaHei" w:hAnsi="Microsoft YaHei"/>
+        </w:rPr>
+        <w:t>线上 GET https://jackyun.top/schedule 返回 200，页面标题为“学习日程 · JackYun Portal”。线上 GET /sw.js 返回 200，已包含缓存版本 v14 与新的导航重试逻辑。</w:t>
+      </w:r>
+    </w:p>
+    <w:p>
+      <w:pPr>
+        <w:spacing w:after="0"/>
+      </w:pPr>
+      <w:r>
+        <w:rPr>
+          <w:rFonts w:ascii="Microsoft YaHei" w:hAnsi="Microsoft YaHei"/>
+        </w:rPr>
+        <w:t>验证边界：线上检查确认了匿名页面响应和部署脚本版本；尚未在用户真实账号及其设备缓存环境中再次操作浏览器直接访问。</w:t>
       </w:r>
     </w:p>
     <w:sectPr>

</xml_diff>